<commit_message>
The elective proposal scrubbed of AI-tell typography (John's word, 2026-09-08, extending the rule set on the Liberty document: reviewers will be sensitive to signs of AI writing). All em dashes replaced with parentheses, colons, commas, or sentence splits; week ranges to plain hyphens; the middle dots gone from the submission line; the 'Notice what that sentence does not say' move rewritten plainly ('That sentence makes no promise that the teacher changes anyone, or that the exercises do'). Substance, boundaries, and the bright line untouched; the internal draft note now reads v2. Word copy rebuilt beside it. Verified zero em dashes, en dashes, and middle dots in the source. DEV ONLY, not submitted.
Co-Authored-By: Claude Fable 5 <noreply@anthropic.com>
</commit_message>
<xml_diff>
--- a/_implementation-notes/FotH Elective - CCA Proposal DRAFT v1.docx
+++ b/_implementation-notes/FotH Elective - CCA Proposal DRAFT v1.docx
@@ -34,13 +34,13 @@
         <w:pStyle w:val="FirstParagraph"/>
       </w:pPr>
       <w:r>
-        <w:t xml:space="preserve">Submitted to the leadership of Covenant Christian Academy of Warrenton ·</w:t>
-      </w:r>
-      <w:r>
-        <w:t xml:space="preserve"> </w:t>
-      </w:r>
-      <w:r>
-        <w:t xml:space="preserve">Attn: Andrea Sponsler, Head of School · John G. Tittle · [Date]</w:t>
+        <w:t xml:space="preserve">Submitted to the leadership of Covenant Christian Academy of Warrenton,</w:t>
+      </w:r>
+      <w:r>
+        <w:t xml:space="preserve"> </w:t>
+      </w:r>
+      <w:r>
+        <w:t xml:space="preserve">Attn: Andrea Sponsler, Head of School. John G. Tittle, [Date]</w:t>
       </w:r>
     </w:p>
     <w:p>
@@ -78,7 +78,7 @@
         <w:t xml:space="preserve"> </w:t>
       </w:r>
       <w:r>
-        <w:t xml:space="preserve">formation — connecting with self, with others, with God, and with mission —</w:t>
+        <w:t xml:space="preserve">formation (connecting with self, with others, with God, and with mission),</w:t>
       </w:r>
       <w:r>
         <w:t xml:space="preserve"> </w:t>
@@ -110,13 +110,13 @@
         <w:t xml:space="preserve"> </w:t>
       </w:r>
       <w:r>
-        <w:t xml:space="preserve">supported it enthusiastically, and the consent form received legal review —</w:t>
-      </w:r>
-      <w:r>
-        <w:t xml:space="preserve"> </w:t>
-      </w:r>
-      <w:r>
-        <w:t xml:space="preserve">and then no families enrolled. The structured interviews I held afterward</w:t>
+        <w:t xml:space="preserve">supported it enthusiastically, and the consent form received legal review.</w:t>
+      </w:r>
+      <w:r>
+        <w:t xml:space="preserve"> </w:t>
+      </w:r>
+      <w:r>
+        <w:t xml:space="preserve">And then no families enrolled. The structured interviews I held afterward</w:t>
       </w:r>
       <w:r>
         <w:t xml:space="preserve"> </w:t>
@@ -178,7 +178,7 @@
         <w:t xml:space="preserve"> </w:t>
       </w:r>
       <w:r>
-        <w:t xml:space="preserve">who want more. The two are designed to fit together, not compete.</w:t>
+        <w:t xml:space="preserve">who want more. The two are designed to fit together rather than compete.</w:t>
       </w:r>
     </w:p>
     <w:bookmarkEnd w:id="11"/>
@@ -212,7 +212,7 @@
         <w:t xml:space="preserve"> </w:t>
       </w:r>
       <w:r>
-        <w:t xml:space="preserve">semester — [Spring 2027, or the next registration window the calendar</w:t>
+        <w:t xml:space="preserve">semester: [Spring 2027, or the next registration window the calendar</w:t>
       </w:r>
       <w:r>
         <w:t xml:space="preserve"> </w:t>
@@ -332,7 +332,7 @@
         <w:t xml:space="preserve"> </w:t>
       </w:r>
       <w:r>
-        <w:t xml:space="preserve">and trusted adults over the room who can see how it is going — then the door</w:t>
+        <w:t xml:space="preserve">and trusted adults over the room who can see how it is going, then the door</w:t>
       </w:r>
       <w:r>
         <w:t xml:space="preserve"> </w:t>
@@ -350,25 +350,25 @@
         <w:t xml:space="preserve"> </w:t>
       </w:r>
       <w:r>
-        <w:t xml:space="preserve">intentional path to grow up into Christ. Notice what that sentence does not</w:t>
-      </w:r>
-      <w:r>
-        <w:t xml:space="preserve"> </w:t>
-      </w:r>
-      <w:r>
-        <w:t xml:space="preserve">say. It does not say the teacher changes anyone, or the exercises change</w:t>
-      </w:r>
-      <w:r>
-        <w:t xml:space="preserve"> </w:t>
-      </w:r>
-      <w:r>
-        <w:t xml:space="preserve">anyone. Nothing in this course is a lever. Everything in it only opens a</w:t>
-      </w:r>
-      <w:r>
-        <w:t xml:space="preserve"> </w:t>
-      </w:r>
-      <w:r>
-        <w:t xml:space="preserve">door, and the Spirit walks through it, or does not, in His time.</w:t>
+        <w:t xml:space="preserve">intentional path to grow up into Christ. That sentence makes no promise that</w:t>
+      </w:r>
+      <w:r>
+        <w:t xml:space="preserve"> </w:t>
+      </w:r>
+      <w:r>
+        <w:t xml:space="preserve">the teacher changes anyone, or that the exercises do. Nothing in this course</w:t>
+      </w:r>
+      <w:r>
+        <w:t xml:space="preserve"> </w:t>
+      </w:r>
+      <w:r>
+        <w:t xml:space="preserve">is a lever. Everything in it only opens a door, and the Spirit walks through</w:t>
+      </w:r>
+      <w:r>
+        <w:t xml:space="preserve"> </w:t>
+      </w:r>
+      <w:r>
+        <w:t xml:space="preserve">it, or does not, in His time.</w:t>
       </w:r>
     </w:p>
     <w:p>
@@ -410,7 +410,7 @@
         <w:t xml:space="preserve"> </w:t>
       </w:r>
       <w:r>
-        <w:t xml:space="preserve">[Instructor arrangement — employment or volunteer status — as CCA prefers.]</w:t>
+        <w:t xml:space="preserve">[Instructor arrangement, employment or volunteer status, as CCA prefers.]</w:t>
       </w:r>
     </w:p>
     <w:bookmarkEnd w:id="12"/>
@@ -432,7 +432,7 @@
           <w:b/>
           <w:bCs/>
         </w:rPr>
-        <w:t xml:space="preserve">Connect with Self (weeks 1–5).</w:t>
+        <w:t xml:space="preserve">Connect with Self (weeks 1-5).</w:t>
       </w:r>
       <w:r>
         <w:t xml:space="preserve"> </w:t>
@@ -462,13 +462,13 @@
         <w:t xml:space="preserve"> </w:t>
       </w:r>
       <w:r>
-        <w:t xml:space="preserve">heart — wounds, lies, old agreements — taught as a map, not excavated in</w:t>
-      </w:r>
-      <w:r>
-        <w:t xml:space="preserve"> </w:t>
-      </w:r>
-      <w:r>
-        <w:t xml:space="preserve">class.</w:t>
+        <w:t xml:space="preserve">heart (wounds, lies, old agreements), taught as a map rather than excavated</w:t>
+      </w:r>
+      <w:r>
+        <w:t xml:space="preserve"> </w:t>
+      </w:r>
+      <w:r>
+        <w:t xml:space="preserve">in class.</w:t>
       </w:r>
     </w:p>
     <w:p>
@@ -480,7 +480,7 @@
           <w:b/>
           <w:bCs/>
         </w:rPr>
-        <w:t xml:space="preserve">Connect with Others (weeks 6–9).</w:t>
+        <w:t xml:space="preserve">Connect with Others (weeks 6-9).</w:t>
       </w:r>
       <w:r>
         <w:t xml:space="preserve"> </w:t>
@@ -516,7 +516,7 @@
           <w:b/>
           <w:bCs/>
         </w:rPr>
-        <w:t xml:space="preserve">Connect with God (weeks 10–13).</w:t>
+        <w:t xml:space="preserve">Connect with God (weeks 10-13).</w:t>
       </w:r>
       <w:r>
         <w:t xml:space="preserve"> </w:t>
@@ -546,7 +546,7 @@
           <w:b/>
           <w:bCs/>
         </w:rPr>
-        <w:t xml:space="preserve">Connect with Mission (weeks 14–16).</w:t>
+        <w:t xml:space="preserve">Connect with Mission (weeks 14-16).</w:t>
       </w:r>
       <w:r>
         <w:t xml:space="preserve"> </w:t>
@@ -567,13 +567,13 @@
         <w:t xml:space="preserve">“where are you sent?”</w:t>
       </w:r>
       <w:r>
-        <w:t xml:space="preserve">; each student drafts a personal rule of life —</w:t>
-      </w:r>
-      <w:r>
-        <w:t xml:space="preserve"> </w:t>
-      </w:r>
-      <w:r>
-        <w:t xml:space="preserve">their own daily, weekly, and monthly rhythm.</w:t>
+        <w:t xml:space="preserve">; each student drafts a personal rule of life, their</w:t>
+      </w:r>
+      <w:r>
+        <w:t xml:space="preserve"> </w:t>
+      </w:r>
+      <w:r>
+        <w:t xml:space="preserve">own daily, weekly, and monthly rhythm.</w:t>
       </w:r>
     </w:p>
     <w:p>
@@ -591,19 +591,19 @@
         <w:t xml:space="preserve"> </w:t>
       </w:r>
       <w:r>
-        <w:t xml:space="preserve">Integration, the capstone reflection, and the invitation onward</w:t>
-      </w:r>
-      <w:r>
-        <w:t xml:space="preserve"> </w:t>
-      </w:r>
-      <w:r>
-        <w:t xml:space="preserve">— including to the evening family fellowship for students and parents who</w:t>
-      </w:r>
-      <w:r>
-        <w:t xml:space="preserve"> </w:t>
-      </w:r>
-      <w:r>
-        <w:t xml:space="preserve">want the deeper work.</w:t>
+        <w:t xml:space="preserve">Integration, the capstone reflection, and the invitation</w:t>
+      </w:r>
+      <w:r>
+        <w:t xml:space="preserve"> </w:t>
+      </w:r>
+      <w:r>
+        <w:t xml:space="preserve">onward, including to the evening family fellowship for students and parents</w:t>
+      </w:r>
+      <w:r>
+        <w:t xml:space="preserve"> </w:t>
+      </w:r>
+      <w:r>
+        <w:t xml:space="preserve">who want the deeper work.</w:t>
       </w:r>
     </w:p>
     <w:p>
@@ -633,7 +633,7 @@
         <w:t xml:space="preserve"> </w:t>
       </w:r>
       <w:r>
-        <w:t xml:space="preserve">exercise segments only — prepared in a short check-in with me beforehand.</w:t>
+        <w:t xml:space="preserve">exercise segments only, prepared in a short check-in with me beforehand.</w:t>
       </w:r>
       <w:r>
         <w:t xml:space="preserve"> </w:t>
@@ -777,7 +777,7 @@
         <w:t xml:space="preserve"> </w:t>
       </w:r>
       <w:r>
-        <w:t xml:space="preserve">graded on engagement with the process, never on depth or content. No</w:t>
+        <w:t xml:space="preserve">graded on engagement with the process rather than on depth or content. No</w:t>
       </w:r>
       <w:r>
         <w:t xml:space="preserve"> </w:t>
@@ -802,16 +802,13 @@
         <w:t xml:space="preserve">When something real surfaces anyway</w:t>
       </w:r>
       <w:r>
-        <w:t xml:space="preserve"> </w:t>
-      </w:r>
-      <w:r>
-        <w:t xml:space="preserve">— and in honest work it sometimes</w:t>
-      </w:r>
-      <w:r>
-        <w:t xml:space="preserve"> </w:t>
-      </w:r>
-      <w:r>
-        <w:t xml:space="preserve">will — it goes to the receiving end CCA already has: the care and</w:t>
+        <w:t xml:space="preserve">, and in honest work it sometimes</w:t>
+      </w:r>
+      <w:r>
+        <w:t xml:space="preserve"> </w:t>
+      </w:r>
+      <w:r>
+        <w:t xml:space="preserve">will, it goes to the receiving end CCA already has: the care and</w:t>
       </w:r>
       <w:r>
         <w:t xml:space="preserve"> </w:t>
@@ -1002,13 +999,13 @@
         <w:t xml:space="preserve"> </w:t>
       </w:r>
       <w:r>
-        <w:t xml:space="preserve">counseling and care structure, the reporting chain, and records practice</w:t>
-      </w:r>
-      <w:r>
-        <w:t xml:space="preserve"> </w:t>
-      </w:r>
-      <w:r>
-        <w:t xml:space="preserve">— reaffirmed for the elective.</w:t>
+        <w:t xml:space="preserve">counseling and care structure, the reporting chain, and records practice,</w:t>
+      </w:r>
+      <w:r>
+        <w:t xml:space="preserve"> </w:t>
+      </w:r>
+      <w:r>
+        <w:t xml:space="preserve">reaffirmed for the elective.</w:t>
       </w:r>
     </w:p>
     <w:p>
@@ -1067,10 +1064,7 @@
         <w:t xml:space="preserve">The instructor arrangement</w:t>
       </w:r>
       <w:r>
-        <w:t xml:space="preserve"> </w:t>
-      </w:r>
-      <w:r>
-        <w:t xml:space="preserve">— whatever standing CCA prefers for me for</w:t>
+        <w:t xml:space="preserve">, whatever standing CCA prefers for me for</w:t>
       </w:r>
       <w:r>
         <w:t xml:space="preserve"> </w:t>
@@ -1106,7 +1100,7 @@
         <w:t xml:space="preserve"> </w:t>
       </w:r>
       <w:r>
-        <w:t xml:space="preserve">the God who is all three — with the same seriousness of method the school</w:t>
+        <w:t xml:space="preserve">the God who is all three, with the same seriousness of method the school</w:t>
       </w:r>
       <w:r>
         <w:t xml:space="preserve"> </w:t>
@@ -1185,7 +1179,7 @@
           <w:i/>
           <w:iCs/>
         </w:rPr>
-        <w:t xml:space="preserve">DRAFT v1 for John’s review — not yet submitted. The bracketed items</w:t>
+        <w:t xml:space="preserve">DRAFT v2 for John’s review, not yet submitted. The bracketed items</w:t>
       </w:r>
       <w:r>
         <w:rPr>

</xml_diff>